<commit_message>
Rediseña figura de estrategias cruzadas DOFA para mayor legibilidad
</commit_message>
<xml_diff>
--- a/DOFA-Analisis-CIE.docx
+++ b/DOFA-Analisis-CIE.docx
@@ -1143,7 +1143,7 @@
       <w:r>
         <w:drawing>
           <wp:inline xmlns:a="http://schemas.openxmlformats.org/drawingml/2006/main" xmlns:pic="http://schemas.openxmlformats.org/drawingml/2006/picture">
-            <wp:extent cx="5852160" cy="4148271"/>
+            <wp:extent cx="5852160" cy="5232043"/>
             <wp:docPr id="2" name="Picture 2"/>
             <wp:cNvGraphicFramePr>
               <a:graphicFrameLocks noChangeAspect="1"/>
@@ -1164,7 +1164,7 @@
                   <pic:spPr>
                     <a:xfrm>
                       <a:off x="0" y="0"/>
-                      <a:ext cx="5852160" cy="4148271"/>
+                      <a:ext cx="5852160" cy="5232043"/>
                     </a:xfrm>
                     <a:prstGeom prst="rect"/>
                   </pic:spPr>

</xml_diff>